<commit_message>
2 interviews - Hoping for conversion soon
</commit_message>
<xml_diff>
--- a/Applications/Sharp & Carter Digital and Technology/CRM Technical Solution Lead/Proposed first 90 days Plan.docx
+++ b/Applications/Sharp & Carter Digital and Technology/CRM Technical Solution Lead/Proposed first 90 days Plan.docx
@@ -908,10 +908,7 @@
         </w:numPr>
       </w:pPr>
       <w:r>
-        <w:t>L</w:t>
-      </w:r>
-      <w:r>
-        <w:t xml:space="preserve">earn about the business by understanding how it operates and how different stakeholders interact with Salesforce. This can be achieved through daily guidance from Helen and Jennifer, participation in brief and purposeful agile ceremonies, and shadowing them during requirements gathering and </w:t>
+        <w:t xml:space="preserve">Learn about the business by understanding how it operates and how different stakeholders interact with Salesforce. This can be achieved through daily guidance from Helen and Jennifer, participation in brief and purposeful agile ceremonies, and shadowing them during requirements gathering and </w:t>
       </w:r>
       <w:r>
         <w:t xml:space="preserve">stakeholder </w:t>
@@ -1015,10 +1012,7 @@
         </w:numPr>
       </w:pPr>
       <w:r>
-        <w:t>P</w:t>
-      </w:r>
-      <w:r>
-        <w:t xml:space="preserve">rotect </w:t>
+        <w:t xml:space="preserve">Protect </w:t>
       </w:r>
       <w:r>
         <w:t>personal identifi</w:t>
@@ -1786,10 +1780,7 @@
     </w:p>
     <w:p>
       <w:r>
-        <w:t>I</w:t>
-      </w:r>
-      <w:r>
-        <w:t xml:space="preserve">f not </w:t>
+        <w:t xml:space="preserve">If not </w:t>
       </w:r>
       <w:r>
         <w:t xml:space="preserve">completed </w:t>

</xml_diff>